<commit_message>
Add explicit RQ1-RQ5 framing to Introduction
</commit_message>
<xml_diff>
--- a/paper/main.docx
+++ b/paper/main.docx
@@ -469,7 +469,7 @@
         <w:t xml:space="preserve"> </w:t>
       </w:r>
       <w:r>
-        <w:t xml:space="preserve">non-linear order (Siddik et al., 2025). We wanted to know how bad the</w:t>
+        <w:t xml:space="preserve">non-linear order (Siddik et al.(2025)Siddik, Li, and Bezemer). We wanted to know how bad the</w:t>
       </w:r>
       <w:r>
         <w:t xml:space="preserve"> </w:t>
@@ -562,7 +562,13 @@
         <w:pStyle w:val="BodyText"/>
       </w:pPr>
       <w:r>
-        <w:t xml:space="preserve">This paper makes four contributions:</w:t>
+        <w:t xml:space="preserve">We organize our empirical investigation around five research questions,</w:t>
+      </w:r>
+      <w:r>
+        <w:t xml:space="preserve"> </w:t>
+      </w:r>
+      <w:r>
+        <w:t xml:space="preserve">each answered in a specific part of the paper rather than left implicit:</w:t>
       </w:r>
     </w:p>
     <w:p>
@@ -577,85 +583,42 @@
           <w:b/>
           <w:bCs/>
         </w:rPr>
-        <w:t xml:space="preserve">A three-tier treatment framework.</w:t>
-      </w:r>
-      <w:r>
-        <w:t xml:space="preserve"> </w:t>
-      </w:r>
-      <w:r>
-        <w:t xml:space="preserve">We separate what a</w:t>
-      </w:r>
-      <w:r>
-        <w:t xml:space="preserve"> </w:t>
-      </w:r>
-      <w:r>
-        <w:t xml:space="preserve">preprocessing tool can actually</w:t>
-      </w:r>
-      <w:r>
-        <w:t xml:space="preserve"> </w:t>
-      </w:r>
-      <w:r>
-        <w:rPr>
-          <w:i/>
-          <w:iCs/>
-        </w:rPr>
-        <w:t xml:space="preserve">resolve</w:t>
-      </w:r>
-      <w:r>
-        <w:t xml:space="preserve"> </w:t>
-      </w:r>
-      <w:r>
-        <w:t xml:space="preserve">on its own from</w:t>
-      </w:r>
-      <w:r>
-        <w:t xml:space="preserve"> </w:t>
-      </w:r>
-      <w:r>
-        <w:t xml:space="preserve">what it can only</w:t>
-      </w:r>
-      <w:r>
-        <w:t xml:space="preserve"> </w:t>
-      </w:r>
-      <w:r>
-        <w:rPr>
-          <w:i/>
-          <w:iCs/>
-        </w:rPr>
-        <w:t xml:space="preserve">detect and flag</w:t>
-      </w:r>
-      <w:r>
-        <w:t xml:space="preserve"> </w:t>
-      </w:r>
-      <w:r>
-        <w:t xml:space="preserve">because the true value</w:t>
-      </w:r>
-      <w:r>
-        <w:t xml:space="preserve"> </w:t>
-      </w:r>
-      <w:r>
-        <w:t xml:space="preserve">was simply never written down anywhere in the file, and from what</w:t>
-      </w:r>
-      <w:r>
-        <w:t xml:space="preserve"> </w:t>
-      </w:r>
-      <w:r>
-        <w:t xml:space="preserve">genuinely requires</w:t>
-      </w:r>
-      <w:r>
-        <w:t xml:space="preserve"> </w:t>
-      </w:r>
-      <w:r>
-        <w:rPr>
-          <w:i/>
-          <w:iCs/>
-        </w:rPr>
-        <w:t xml:space="preserve">running the code</w:t>
-      </w:r>
-      <w:r>
-        <w:t xml:space="preserve"> </w:t>
-      </w:r>
-      <w:r>
-        <w:t xml:space="preserve">to know for certain.</w:t>
+        <w:t xml:space="preserve">RQ1.</w:t>
+      </w:r>
+      <w:r>
+        <w:t xml:space="preserve"> </w:t>
+      </w:r>
+      <w:r>
+        <w:t xml:space="preserve">How prevalent are non-linear execution and other</w:t>
+      </w:r>
+      <w:r>
+        <w:t xml:space="preserve"> </w:t>
+      </w:r>
+      <w:r>
+        <w:t xml:space="preserve">state hazards in real, crashed machine-learning notebooks, the</w:t>
+      </w:r>
+      <w:r>
+        <w:t xml:space="preserve"> </w:t>
+      </w:r>
+      <w:r>
+        <w:t xml:space="preserve">population most likely to be handed to an LLM for debugging?</w:t>
+      </w:r>
+      <w:r>
+        <w:t xml:space="preserve"> </w:t>
+      </w:r>
+      <w:r>
+        <w:t xml:space="preserve">(Sect. </w:t>
+      </w:r>
+      <w:hyperlink w:anchor="sec:scan">
+        <w:r>
+          <w:rPr>
+            <w:rStyle w:val="Hyperlink"/>
+          </w:rPr>
+          <w:t xml:space="preserve">5.3</w:t>
+        </w:r>
+      </w:hyperlink>
+      <w:r>
+        <w:t xml:space="preserve">)</w:t>
       </w:r>
     </w:p>
     <w:p>
@@ -670,70 +633,42 @@
           <w:b/>
           <w:bCs/>
         </w:rPr>
-        <w:t xml:space="preserve">JupPreprocessor</w:t>
-      </w:r>
-      <w:r>
-        <w:t xml:space="preserve">, an implementation of the first two</w:t>
-      </w:r>
-      <w:r>
-        <w:t xml:space="preserve"> </w:t>
-      </w:r>
-      <w:r>
-        <w:t xml:space="preserve">tiers that never calls an LLM and never executes any code itself.</w:t>
-      </w:r>
-      <w:r>
-        <w:t xml:space="preserve"> </w:t>
-      </w:r>
-      <w:r>
-        <w:t xml:space="preserve">It adds six lightweight annotations to a notebook (a history of</w:t>
-      </w:r>
-      <w:r>
-        <w:t xml:space="preserve"> </w:t>
-      </w:r>
-      <w:r>
-        <w:t xml:space="preserve">how each variable was mutated over time, the last value a deleted</w:t>
-      </w:r>
-      <w:r>
-        <w:t xml:space="preserve"> </w:t>
-      </w:r>
-      <w:r>
-        <w:t xml:space="preserve">“ghost”</w:t>
-      </w:r>
-      <w:r>
-        <w:t xml:space="preserve"> </w:t>
-      </w:r>
-      <w:r>
-        <w:t xml:space="preserve">variable was seen holding, a flag for code whose output</w:t>
-      </w:r>
-      <w:r>
-        <w:t xml:space="preserve"> </w:t>
-      </w:r>
-      <w:r>
-        <w:t xml:space="preserve">may not be reproducible, whether an error was later worked around</w:t>
-      </w:r>
-      <w:r>
-        <w:t xml:space="preserve"> </w:t>
-      </w:r>
-      <w:r>
-        <w:t xml:space="preserve">or was fatal, inferred type and shape information, and a flag for</w:t>
-      </w:r>
-      <w:r>
-        <w:t xml:space="preserve"> </w:t>
-      </w:r>
-      <w:r>
-        <w:t xml:space="preserve">a specific weakness in its own ordering logic that we discovered</w:t>
-      </w:r>
-      <w:r>
-        <w:t xml:space="preserve"> </w:t>
-      </w:r>
-      <w:r>
-        <w:t xml:space="preserve">and describe below, affecting 26.6% of real notebooks). All six</w:t>
-      </w:r>
-      <w:r>
-        <w:t xml:space="preserve"> </w:t>
-      </w:r>
-      <w:r>
-        <w:t xml:space="preserve">together cost well under 1% in extra tokens.</w:t>
+        <w:t xml:space="preserve">RQ2.</w:t>
+      </w:r>
+      <w:r>
+        <w:t xml:space="preserve"> </w:t>
+      </w:r>
+      <w:r>
+        <w:t xml:space="preserve">Does execution-order reconstruction measurably</w:t>
+      </w:r>
+      <w:r>
+        <w:t xml:space="preserve"> </w:t>
+      </w:r>
+      <w:r>
+        <w:t xml:space="preserve">improve LLM state-tracking accuracy on a fair, context-bounded</w:t>
+      </w:r>
+      <w:r>
+        <w:t xml:space="preserve"> </w:t>
+      </w:r>
+      <w:r>
+        <w:t xml:space="preserve">synthetic benchmark, isolated from mere retrieval-under-noise</w:t>
+      </w:r>
+      <w:r>
+        <w:t xml:space="preserve"> </w:t>
+      </w:r>
+      <w:r>
+        <w:t xml:space="preserve">and from token-count confounds? (Sect. </w:t>
+      </w:r>
+      <w:hyperlink w:anchor="sec:niah">
+        <w:r>
+          <w:rPr>
+            <w:rStyle w:val="Hyperlink"/>
+          </w:rPr>
+          <w:t xml:space="preserve">5.2</w:t>
+        </w:r>
+      </w:hyperlink>
+      <w:r>
+        <w:t xml:space="preserve">)</w:t>
       </w:r>
     </w:p>
     <w:p>
@@ -748,79 +683,53 @@
           <w:b/>
           <w:bCs/>
         </w:rPr>
-        <w:t xml:space="preserve">A fair benchmark we call Notebook-NIAH.</w:t>
-      </w:r>
-      <w:r>
-        <w:t xml:space="preserve"> </w:t>
-      </w:r>
-      <w:r>
-        <w:t xml:space="preserve">It is built so</w:t>
-      </w:r>
-      <w:r>
-        <w:t xml:space="preserve"> </w:t>
-      </w:r>
-      <w:r>
-        <w:t xml:space="preserve">that the baseline condition always fits inside the model’s</w:t>
-      </w:r>
-      <w:r>
-        <w:t xml:space="preserve"> </w:t>
-      </w:r>
-      <w:r>
-        <w:t xml:space="preserve">context window; running out of room is recorded as its own</w:t>
-      </w:r>
-      <w:r>
-        <w:t xml:space="preserve"> </w:t>
-      </w:r>
-      <w:r>
-        <w:t xml:space="preserve">outcome, never scored as a wrong answer. It includes a</w:t>
-      </w:r>
-      <w:r>
-        <w:t xml:space="preserve"> </w:t>
-      </w:r>
-      <w:r>
-        <w:t xml:space="preserve">compression-only control, a comparison between a</w:t>
-      </w:r>
-      <w:r>
-        <w:t xml:space="preserve"> </w:t>
-      </w:r>
-      <w:r>
-        <w:t xml:space="preserve">“static”</w:t>
-      </w:r>
-      <w:r>
-        <w:t xml:space="preserve"> </w:t>
-      </w:r>
-      <w:r>
-        <w:t xml:space="preserve">task</w:t>
-      </w:r>
-      <w:r>
-        <w:t xml:space="preserve"> </w:t>
-      </w:r>
-      <w:r>
-        <w:t xml:space="preserve">(plain retrieval) and a</w:t>
-      </w:r>
-      <w:r>
-        <w:t xml:space="preserve"> </w:t>
-      </w:r>
-      <w:r>
-        <w:t xml:space="preserve">“stateful”</w:t>
-      </w:r>
-      <w:r>
-        <w:t xml:space="preserve"> </w:t>
-      </w:r>
-      <w:r>
-        <w:t xml:space="preserve">task (state reconstruction) to</w:t>
-      </w:r>
-      <w:r>
-        <w:t xml:space="preserve"> </w:t>
-      </w:r>
-      <w:r>
-        <w:t xml:space="preserve">separate the two skills, component-by-component ablations, and a</w:t>
-      </w:r>
-      <w:r>
-        <w:t xml:space="preserve"> </w:t>
-      </w:r>
-      <w:r>
-        <w:t xml:space="preserve">capability curve spanning fifteen models across seven vendors.</w:t>
+        <w:t xml:space="preserve">RQ3.</w:t>
+      </w:r>
+      <w:r>
+        <w:t xml:space="preserve"> </w:t>
+      </w:r>
+      <w:r>
+        <w:t xml:space="preserve">Does this synthetic-benchmark advantage transfer</w:t>
+      </w:r>
+      <w:r>
+        <w:t xml:space="preserve"> </w:t>
+      </w:r>
+      <w:r>
+        <w:t xml:space="preserve">to real, messy notebooks, when measured against executable</w:t>
+      </w:r>
+      <w:r>
+        <w:t xml:space="preserve"> </w:t>
+      </w:r>
+      <w:r>
+        <w:t xml:space="preserve">ground truth rather than assumed correctness?</w:t>
+      </w:r>
+      <w:r>
+        <w:t xml:space="preserve"> </w:t>
+      </w:r>
+      <w:r>
+        <w:t xml:space="preserve">(Sect. </w:t>
+      </w:r>
+      <w:hyperlink w:anchor="sec:realnb">
+        <w:r>
+          <w:rPr>
+            <w:rStyle w:val="Hyperlink"/>
+          </w:rPr>
+          <w:t xml:space="preserve">5.4</w:t>
+        </w:r>
+      </w:hyperlink>
+      <w:r>
+        <w:t xml:space="preserve">–</w:t>
+      </w:r>
+      <w:hyperlink w:anchor="sec:judgeaudit">
+        <w:r>
+          <w:rPr>
+            <w:rStyle w:val="Hyperlink"/>
+          </w:rPr>
+          <w:t xml:space="preserve">5.5</w:t>
+        </w:r>
+      </w:hyperlink>
+      <w:r>
+        <w:t xml:space="preserve">)</w:t>
       </w:r>
     </w:p>
     <w:p>
@@ -828,6 +737,378 @@
         <w:numPr>
           <w:ilvl w:val="0"/>
           <w:numId w:val="1001"/>
+        </w:numPr>
+      </w:pPr>
+      <w:r>
+        <w:rPr>
+          <w:b/>
+          <w:bCs/>
+        </w:rPr>
+        <w:t xml:space="preserve">RQ4.</w:t>
+      </w:r>
+      <w:r>
+        <w:t xml:space="preserve"> </w:t>
+      </w:r>
+      <w:r>
+        <w:t xml:space="preserve">What is the token-cost and robustness profile of</w:t>
+      </w:r>
+      <w:r>
+        <w:t xml:space="preserve"> </w:t>
+      </w:r>
+      <w:r>
+        <w:t xml:space="preserve">the preprocessing pipeline on real notebooks, and does adding</w:t>
+      </w:r>
+      <w:r>
+        <w:t xml:space="preserve"> </w:t>
+      </w:r>
+      <w:r>
+        <w:t xml:space="preserve">state-safety annotations erode the token savings? (Sect. 5.1)</w:t>
+      </w:r>
+    </w:p>
+    <w:p>
+      <w:pPr>
+        <w:numPr>
+          <w:ilvl w:val="0"/>
+          <w:numId w:val="1001"/>
+        </w:numPr>
+      </w:pPr>
+      <w:r>
+        <w:rPr>
+          <w:b/>
+          <w:bCs/>
+        </w:rPr>
+        <w:t xml:space="preserve">RQ5.</w:t>
+      </w:r>
+      <w:r>
+        <w:t xml:space="preserve"> </w:t>
+      </w:r>
+      <w:r>
+        <w:t xml:space="preserve">Where does the approach fail or reach its limits,</w:t>
+      </w:r>
+      <w:r>
+        <w:t xml:space="preserve"> </w:t>
+      </w:r>
+      <w:r>
+        <w:t xml:space="preserve">on already-clean data, in the preprocessor’s own core</w:t>
+      </w:r>
+      <w:r>
+        <w:t xml:space="preserve"> </w:t>
+      </w:r>
+      <w:r>
+        <w:t xml:space="preserve">execution-order-sort mechanism, and relative to alternative</w:t>
+      </w:r>
+      <w:r>
+        <w:t xml:space="preserve"> </w:t>
+      </w:r>
+      <w:r>
+        <w:t xml:space="preserve">architectures such as reactive notebooks?</w:t>
+      </w:r>
+      <w:r>
+        <w:t xml:space="preserve"> </w:t>
+      </w:r>
+      <w:r>
+        <w:t xml:space="preserve">(Sect. </w:t>
+      </w:r>
+      <w:hyperlink w:anchor="sec:honestneg">
+        <w:r>
+          <w:rPr>
+            <w:rStyle w:val="Hyperlink"/>
+          </w:rPr>
+          <w:t xml:space="preserve">5.6</w:t>
+        </w:r>
+      </w:hyperlink>
+      <w:r>
+        <w:t xml:space="preserve">, Sect. </w:t>
+      </w:r>
+      <w:hyperlink w:anchor="sec:threats">
+        <w:r>
+          <w:rPr>
+            <w:rStyle w:val="Hyperlink"/>
+          </w:rPr>
+          <w:t xml:space="preserve">6</w:t>
+        </w:r>
+      </w:hyperlink>
+      <w:r>
+        <w:t xml:space="preserve">, Sect. 7)</w:t>
+      </w:r>
+    </w:p>
+    <w:p>
+      <w:pPr>
+        <w:pStyle w:val="FirstParagraph"/>
+      </w:pPr>
+      <w:r>
+        <w:t xml:space="preserve">Answering these five questions is also how this paper makes its four</w:t>
+      </w:r>
+      <w:r>
+        <w:t xml:space="preserve"> </w:t>
+      </w:r>
+      <w:r>
+        <w:t xml:space="preserve">main contributions:</w:t>
+      </w:r>
+    </w:p>
+    <w:p>
+      <w:pPr>
+        <w:numPr>
+          <w:ilvl w:val="0"/>
+          <w:numId w:val="1002"/>
+        </w:numPr>
+      </w:pPr>
+      <w:r>
+        <w:rPr>
+          <w:b/>
+          <w:bCs/>
+        </w:rPr>
+        <w:t xml:space="preserve">A three-tier treatment framework.</w:t>
+      </w:r>
+      <w:r>
+        <w:t xml:space="preserve"> </w:t>
+      </w:r>
+      <w:r>
+        <w:t xml:space="preserve">We separate what a</w:t>
+      </w:r>
+      <w:r>
+        <w:t xml:space="preserve"> </w:t>
+      </w:r>
+      <w:r>
+        <w:t xml:space="preserve">preprocessing tool can actually</w:t>
+      </w:r>
+      <w:r>
+        <w:t xml:space="preserve"> </w:t>
+      </w:r>
+      <w:r>
+        <w:rPr>
+          <w:i/>
+          <w:iCs/>
+        </w:rPr>
+        <w:t xml:space="preserve">resolve</w:t>
+      </w:r>
+      <w:r>
+        <w:t xml:space="preserve"> </w:t>
+      </w:r>
+      <w:r>
+        <w:t xml:space="preserve">on its own from</w:t>
+      </w:r>
+      <w:r>
+        <w:t xml:space="preserve"> </w:t>
+      </w:r>
+      <w:r>
+        <w:t xml:space="preserve">what it can only</w:t>
+      </w:r>
+      <w:r>
+        <w:t xml:space="preserve"> </w:t>
+      </w:r>
+      <w:r>
+        <w:rPr>
+          <w:i/>
+          <w:iCs/>
+        </w:rPr>
+        <w:t xml:space="preserve">detect and flag</w:t>
+      </w:r>
+      <w:r>
+        <w:t xml:space="preserve"> </w:t>
+      </w:r>
+      <w:r>
+        <w:t xml:space="preserve">because the true value</w:t>
+      </w:r>
+      <w:r>
+        <w:t xml:space="preserve"> </w:t>
+      </w:r>
+      <w:r>
+        <w:t xml:space="preserve">was simply never written down anywhere in the file, and from what</w:t>
+      </w:r>
+      <w:r>
+        <w:t xml:space="preserve"> </w:t>
+      </w:r>
+      <w:r>
+        <w:t xml:space="preserve">genuinely requires</w:t>
+      </w:r>
+      <w:r>
+        <w:t xml:space="preserve"> </w:t>
+      </w:r>
+      <w:r>
+        <w:rPr>
+          <w:i/>
+          <w:iCs/>
+        </w:rPr>
+        <w:t xml:space="preserve">running the code</w:t>
+      </w:r>
+      <w:r>
+        <w:t xml:space="preserve"> </w:t>
+      </w:r>
+      <w:r>
+        <w:t xml:space="preserve">to know for certain.</w:t>
+      </w:r>
+    </w:p>
+    <w:p>
+      <w:pPr>
+        <w:numPr>
+          <w:ilvl w:val="0"/>
+          <w:numId w:val="1002"/>
+        </w:numPr>
+      </w:pPr>
+      <w:r>
+        <w:rPr>
+          <w:b/>
+          <w:bCs/>
+        </w:rPr>
+        <w:t xml:space="preserve">JupPreprocessor</w:t>
+      </w:r>
+      <w:r>
+        <w:t xml:space="preserve">, an implementation of the first two</w:t>
+      </w:r>
+      <w:r>
+        <w:t xml:space="preserve"> </w:t>
+      </w:r>
+      <w:r>
+        <w:t xml:space="preserve">tiers that never calls an LLM and never executes any code itself.</w:t>
+      </w:r>
+      <w:r>
+        <w:t xml:space="preserve"> </w:t>
+      </w:r>
+      <w:r>
+        <w:t xml:space="preserve">It adds six lightweight annotations to a notebook (a history of</w:t>
+      </w:r>
+      <w:r>
+        <w:t xml:space="preserve"> </w:t>
+      </w:r>
+      <w:r>
+        <w:t xml:space="preserve">how each variable was mutated over time, the last value a deleted</w:t>
+      </w:r>
+      <w:r>
+        <w:t xml:space="preserve"> </w:t>
+      </w:r>
+      <w:r>
+        <w:t xml:space="preserve">“ghost”</w:t>
+      </w:r>
+      <w:r>
+        <w:t xml:space="preserve"> </w:t>
+      </w:r>
+      <w:r>
+        <w:t xml:space="preserve">variable was seen holding, a flag for code whose output</w:t>
+      </w:r>
+      <w:r>
+        <w:t xml:space="preserve"> </w:t>
+      </w:r>
+      <w:r>
+        <w:t xml:space="preserve">may not be reproducible, whether an error was later worked around</w:t>
+      </w:r>
+      <w:r>
+        <w:t xml:space="preserve"> </w:t>
+      </w:r>
+      <w:r>
+        <w:t xml:space="preserve">or was fatal, inferred type and shape information, and a flag for</w:t>
+      </w:r>
+      <w:r>
+        <w:t xml:space="preserve"> </w:t>
+      </w:r>
+      <w:r>
+        <w:t xml:space="preserve">a specific weakness in its own ordering logic that we discovered</w:t>
+      </w:r>
+      <w:r>
+        <w:t xml:space="preserve"> </w:t>
+      </w:r>
+      <w:r>
+        <w:t xml:space="preserve">and describe below, affecting 26.6% of real notebooks). All six</w:t>
+      </w:r>
+      <w:r>
+        <w:t xml:space="preserve"> </w:t>
+      </w:r>
+      <w:r>
+        <w:t xml:space="preserve">together cost well under 1% in extra tokens.</w:t>
+      </w:r>
+    </w:p>
+    <w:p>
+      <w:pPr>
+        <w:numPr>
+          <w:ilvl w:val="0"/>
+          <w:numId w:val="1002"/>
+        </w:numPr>
+      </w:pPr>
+      <w:r>
+        <w:rPr>
+          <w:b/>
+          <w:bCs/>
+        </w:rPr>
+        <w:t xml:space="preserve">A fair benchmark we call Notebook-NIAH.</w:t>
+      </w:r>
+      <w:r>
+        <w:t xml:space="preserve"> </w:t>
+      </w:r>
+      <w:r>
+        <w:t xml:space="preserve">It is built so</w:t>
+      </w:r>
+      <w:r>
+        <w:t xml:space="preserve"> </w:t>
+      </w:r>
+      <w:r>
+        <w:t xml:space="preserve">that the baseline condition always fits inside the model’s</w:t>
+      </w:r>
+      <w:r>
+        <w:t xml:space="preserve"> </w:t>
+      </w:r>
+      <w:r>
+        <w:t xml:space="preserve">context window; running out of room is recorded as its own</w:t>
+      </w:r>
+      <w:r>
+        <w:t xml:space="preserve"> </w:t>
+      </w:r>
+      <w:r>
+        <w:t xml:space="preserve">outcome, never scored as a wrong answer. It includes a</w:t>
+      </w:r>
+      <w:r>
+        <w:t xml:space="preserve"> </w:t>
+      </w:r>
+      <w:r>
+        <w:t xml:space="preserve">compression-only control, a comparison between a</w:t>
+      </w:r>
+      <w:r>
+        <w:t xml:space="preserve"> </w:t>
+      </w:r>
+      <w:r>
+        <w:t xml:space="preserve">“static”</w:t>
+      </w:r>
+      <w:r>
+        <w:t xml:space="preserve"> </w:t>
+      </w:r>
+      <w:r>
+        <w:t xml:space="preserve">task</w:t>
+      </w:r>
+      <w:r>
+        <w:t xml:space="preserve"> </w:t>
+      </w:r>
+      <w:r>
+        <w:t xml:space="preserve">(plain retrieval) and a</w:t>
+      </w:r>
+      <w:r>
+        <w:t xml:space="preserve"> </w:t>
+      </w:r>
+      <w:r>
+        <w:t xml:space="preserve">“stateful”</w:t>
+      </w:r>
+      <w:r>
+        <w:t xml:space="preserve"> </w:t>
+      </w:r>
+      <w:r>
+        <w:t xml:space="preserve">task (state reconstruction) to</w:t>
+      </w:r>
+      <w:r>
+        <w:t xml:space="preserve"> </w:t>
+      </w:r>
+      <w:r>
+        <w:t xml:space="preserve">separate the two skills, component-by-component ablations, and a</w:t>
+      </w:r>
+      <w:r>
+        <w:t xml:space="preserve"> </w:t>
+      </w:r>
+      <w:r>
+        <w:t xml:space="preserve">capability curve spanning fifteen models across seven vendors.</w:t>
+      </w:r>
+    </w:p>
+    <w:p>
+      <w:pPr>
+        <w:numPr>
+          <w:ilvl w:val="0"/>
+          <w:numId w:val="1002"/>
         </w:numPr>
       </w:pPr>
       <w:r>
@@ -2507,7 +2788,7 @@
         <w:t xml:space="preserve"> </w:t>
       </w:r>
       <w:r>
-        <w:t xml:space="preserve">drawn from JunoBench (Wang et al., 2025) (seed 42). All 40 were</w:t>
+        <w:t xml:space="preserve">drawn from JunoBench (Wang et al.(2025)Wang, Hernández López, Nilsson, and Varró) (seed 42). All 40 were</w:t>
       </w:r>
       <w:r>
         <w:t xml:space="preserve"> </w:t>
@@ -4575,7 +4856,7 @@
         <w:t xml:space="preserve"> </w:t>
       </w:r>
       <w:r>
-        <w:t xml:space="preserve">GitHub notebooks in general (Siddik et al., 2025), this suggests that the</w:t>
+        <w:t xml:space="preserve">GitHub notebooks in general (Siddik et al.(2025)Siddik, Li, and Bezemer), this suggests that the</w:t>
       </w:r>
       <w:r>
         <w:t xml:space="preserve"> </w:t>
@@ -6966,7 +7247,7 @@
     </w:p>
     <w:bookmarkEnd w:id="32"/>
     <w:bookmarkEnd w:id="33"/>
-    <w:bookmarkStart w:id="34" w:name="honest-negatives"/>
+    <w:bookmarkStart w:id="34" w:name="sec:honestneg"/>
     <w:p>
       <w:pPr>
         <w:pStyle w:val="Heading2"/>
@@ -6980,7 +7261,7 @@
         <w:pStyle w:val="FirstParagraph"/>
       </w:pPr>
       <w:r>
-        <w:t xml:space="preserve">On the Themisto benchmark (Grotov and Titov, 2025), whose notebooks</w:t>
+        <w:t xml:space="preserve">On the Themisto benchmark (Grotov and Titov(2025)), whose notebooks</w:t>
       </w:r>
       <w:r>
         <w:t xml:space="preserve"> </w:t>
@@ -9130,13 +9411,13 @@
         <w:t xml:space="preserve"> </w:t>
       </w:r>
       <w:r>
-        <w:t xml:space="preserve">(You et al., 2025), CaveAgent (Ran et al., 2026), DeltaBox</w:t>
-      </w:r>
-      <w:r>
-        <w:t xml:space="preserve"> </w:t>
-      </w:r>
-      <w:r>
-        <w:t xml:space="preserve">(Dong et al., 2026), and I-PTC (Gonzalez, 2026), all assume a</w:t>
+        <w:t xml:space="preserve">(You et al.(2025)You, Zhang, Xu, Lou, Yan, Wang, Zhang, and Huang), CaveAgent (Ran et al.(2026)Ran, Wan, Lin, Zhang, Xin, Fan, Xu, and Luo), DeltaBox</w:t>
+      </w:r>
+      <w:r>
+        <w:t xml:space="preserve"> </w:t>
+      </w:r>
+      <w:r>
+        <w:t xml:space="preserve">(Dong et al.(2026)Dong, He, Liu, Hou, Du, Xu, Yu, and Yang), and I-PTC (Gonzalez(2026)), all assume a</w:t>
       </w:r>
       <w:r>
         <w:t xml:space="preserve"> </w:t>
@@ -9148,13 +9429,13 @@
         <w:t xml:space="preserve"> </w:t>
       </w:r>
       <w:r>
-        <w:t xml:space="preserve">assume a kernel tends to be lossy: Jupytext (Jupytext, 2026) and</w:t>
-      </w:r>
-      <w:r>
-        <w:t xml:space="preserve"> </w:t>
-      </w:r>
-      <w:r>
-        <w:t xml:space="preserve">notebookllm (notebookllm, 2026) both strip outputs entirely, and existing</w:t>
+        <w:t xml:space="preserve">assume a kernel tends to be lossy: Jupytext (Jupytext(2026)) and</w:t>
+      </w:r>
+      <w:r>
+        <w:t xml:space="preserve"> </w:t>
+      </w:r>
+      <w:r>
+        <w:t xml:space="preserve">notebookllm (notebookllm(2026)) both strip outputs entirely, and existing</w:t>
       </w:r>
       <w:r>
         <w:t xml:space="preserve"> </w:t>
@@ -9172,19 +9453,19 @@
         <w:t xml:space="preserve"> </w:t>
       </w:r>
       <w:r>
-        <w:t xml:space="preserve">including Themisto (Grotov and Titov, 2025), JunoBench</w:t>
-      </w:r>
-      <w:r>
-        <w:t xml:space="preserve"> </w:t>
-      </w:r>
-      <w:r>
-        <w:t xml:space="preserve">(Wang et al., 2025), NbQA/Jupiter (Li et al., 2025b), and</w:t>
-      </w:r>
-      <w:r>
-        <w:t xml:space="preserve"> </w:t>
-      </w:r>
-      <w:r>
-        <w:t xml:space="preserve">DABStep (Egg et al., 2025), test downstream tasks rather than</w:t>
+        <w:t xml:space="preserve">including Themisto (Grotov and Titov(2025)), JunoBench</w:t>
+      </w:r>
+      <w:r>
+        <w:t xml:space="preserve"> </w:t>
+      </w:r>
+      <w:r>
+        <w:t xml:space="preserve">(Wang et al.(2025)Wang, Hernández López, Nilsson, and Varró), NbQA/Jupiter (Li et al.(2025b)Li, Liu, Du, Zeng, Xu, Zhou, He, and Dong), and</w:t>
+      </w:r>
+      <w:r>
+        <w:t xml:space="preserve"> </w:t>
+      </w:r>
+      <w:r>
+        <w:t xml:space="preserve">DABStep (Egg et al.(2025)Egg, Iglesias Goyanes, Kingma, Mora, von Werra, and Wolf), test downstream tasks rather than</w:t>
       </w:r>
       <w:r>
         <w:t xml:space="preserve"> </w:t>
@@ -9358,7 +9639,7 @@
               <w:jc w:val="left"/>
             </w:pPr>
             <w:r>
-              <w:t xml:space="preserve">CRABS (Li et al., 2025a)</w:t>
+              <w:t xml:space="preserve">CRABS (Li et al.(2025a)Li, McPhillips, Wang, Tsai, and Ludäscher)</w:t>
             </w:r>
           </w:p>
         </w:tc>
@@ -9420,7 +9701,7 @@
               <w:jc w:val="left"/>
             </w:pPr>
             <w:r>
-              <w:t xml:space="preserve">LongDS-Bench (Xu et al., 2026)</w:t>
+              <w:t xml:space="preserve">LongDS-Bench (Xu et al.(2026)Xu, Lu, Qiao, Ding, Xu, Liang, and Zhang)</w:t>
             </w:r>
           </w:p>
         </w:tc>
@@ -9496,7 +9777,7 @@
               <w:jc w:val="left"/>
             </w:pPr>
             <w:r>
-              <w:t xml:space="preserve">DSAgentBench (Rahman et al., 2026)</w:t>
+              <w:t xml:space="preserve">DSAgentBench (Rahman et al.(2026)Rahman, Islam, Mahbub, Laskar, Joty, and Hoque Prince)</w:t>
             </w:r>
           </w:p>
         </w:tc>
@@ -9558,7 +9839,7 @@
               <w:jc w:val="left"/>
             </w:pPr>
             <w:r>
-              <w:t xml:space="preserve">marimo (marimo, 2026)</w:t>
+              <w:t xml:space="preserve">marimo (marimo(2026))</w:t>
             </w:r>
           </w:p>
         </w:tc>
@@ -9700,7 +9981,7 @@
         <w:t xml:space="preserve"> </w:t>
       </w:r>
       <w:r>
-        <w:t xml:space="preserve">(Li et al., 2025a)</w:t>
+        <w:t xml:space="preserve">(Li et al.(2025a)Li, McPhillips, Wang, Tsai, and Ludäscher)</w:t>
       </w:r>
       <w:r>
         <w:t xml:space="preserve"> </w:t>
@@ -9806,7 +10087,7 @@
         <w:t xml:space="preserve"> </w:t>
       </w:r>
       <w:r>
-        <w:t xml:space="preserve">(Xu et al., 2026)</w:t>
+        <w:t xml:space="preserve">(Xu et al.(2026)Xu, Lu, Qiao, Ding, Xu, Liang, and Zhang)</w:t>
       </w:r>
       <w:r>
         <w:t xml:space="preserve"> </w:t>
@@ -9858,7 +10139,7 @@
         <w:t xml:space="preserve"> </w:t>
       </w:r>
       <w:r>
-        <w:t xml:space="preserve">(Rahman et al., 2026) finds that the</w:t>
+        <w:t xml:space="preserve">(Rahman et al.(2026)Rahman, Islam, Mahbub, Laskar, Joty, and Hoque Prince) finds that the</w:t>
       </w:r>
       <w:r>
         <w:t xml:space="preserve"> </w:t>
@@ -9918,7 +10199,7 @@
         <w:t xml:space="preserve"> </w:t>
       </w:r>
       <w:r>
-        <w:t xml:space="preserve">(marimo, 2026), which eliminate hidden state and out-of-order execution</w:t>
+        <w:t xml:space="preserve">(marimo(2026)), which eliminate hidden state and out-of-order execution</w:t>
       </w:r>
       <w:r>
         <w:t xml:space="preserve"> </w:t>
@@ -10574,7 +10855,7 @@
         <w:t xml:space="preserve"> </w:t>
       </w:r>
       <w:r>
-        <w:t xml:space="preserve">(Wang et al., 2025).</w:t>
+        <w:t xml:space="preserve">(Wang et al.(2025)Wang, Hernández López, Nilsson, and Varró).</w:t>
       </w:r>
     </w:p>
     <w:bookmarkEnd w:id="46"/>
@@ -11273,6 +11554,109 @@
       </w:pPr>
     </w:lvl>
   </w:abstractNum>
+  <w:abstractNum w:abstractNumId="991">
+    <w:nsid w:val="0000A991"/>
+    <w:multiLevelType w:val="multilevel"/>
+    <w:lvl w:ilvl="0">
+      <w:numFmt w:val="bullet"/>
+      <w:lvlText w:val=""/>
+      <w:lvlJc w:val="left"/>
+      <w:pPr>
+        <w:ind w:left="720" w:hanging="360"/>
+      </w:pPr>
+      <w:rPr>
+        <w:rFonts w:ascii="Symbol" w:hAnsi="Symbol" w:cs="Symbol" w:hint="default"/>
+      </w:rPr>
+    </w:lvl>
+    <w:lvl w:ilvl="1">
+      <w:numFmt w:val="bullet"/>
+      <w:lvlText w:val="o"/>
+      <w:lvlJc w:val="left"/>
+      <w:pPr>
+        <w:ind w:left="1440" w:hanging="360"/>
+      </w:pPr>
+      <w:rPr>
+        <w:rFonts w:ascii="Courier New" w:hAnsi="Courier New" w:cs="Courier New" w:hint="default"/>
+      </w:rPr>
+    </w:lvl>
+    <w:lvl w:ilvl="2">
+      <w:numFmt w:val="bullet"/>
+      <w:lvlText w:val=""/>
+      <w:lvlJc w:val="left"/>
+      <w:pPr>
+        <w:ind w:left="2160" w:hanging="360"/>
+      </w:pPr>
+      <w:rPr>
+        <w:rFonts w:ascii="Wingdings" w:hAnsi="Wingdings" w:cs="Wingdings" w:hint="default"/>
+      </w:rPr>
+    </w:lvl>
+    <w:lvl w:ilvl="3">
+      <w:numFmt w:val="bullet"/>
+      <w:lvlText w:val=""/>
+      <w:lvlJc w:val="left"/>
+      <w:pPr>
+        <w:ind w:left="2880" w:hanging="360"/>
+      </w:pPr>
+      <w:rPr>
+        <w:rFonts w:ascii="Symbol" w:hAnsi="Symbol" w:cs="Symbol" w:hint="default"/>
+      </w:rPr>
+    </w:lvl>
+    <w:lvl w:ilvl="4">
+      <w:numFmt w:val="bullet"/>
+      <w:lvlText w:val="o"/>
+      <w:lvlJc w:val="left"/>
+      <w:pPr>
+        <w:ind w:left="3600" w:hanging="360"/>
+      </w:pPr>
+      <w:rPr>
+        <w:rFonts w:ascii="Courier New" w:hAnsi="Courier New" w:cs="Courier New" w:hint="default"/>
+      </w:rPr>
+    </w:lvl>
+    <w:lvl w:ilvl="5">
+      <w:numFmt w:val="bullet"/>
+      <w:lvlText w:val=""/>
+      <w:lvlJc w:val="left"/>
+      <w:pPr>
+        <w:ind w:left="4320" w:hanging="360"/>
+      </w:pPr>
+      <w:rPr>
+        <w:rFonts w:ascii="Wingdings" w:hAnsi="Wingdings" w:cs="Wingdings" w:hint="default"/>
+      </w:rPr>
+    </w:lvl>
+    <w:lvl w:ilvl="6">
+      <w:numFmt w:val="bullet"/>
+      <w:lvlText w:val=""/>
+      <w:lvlJc w:val="left"/>
+      <w:pPr>
+        <w:ind w:left="5040" w:hanging="360"/>
+      </w:pPr>
+      <w:rPr>
+        <w:rFonts w:ascii="Symbol" w:hAnsi="Symbol" w:cs="Symbol" w:hint="default"/>
+      </w:rPr>
+    </w:lvl>
+    <w:lvl w:ilvl="7">
+      <w:numFmt w:val="bullet"/>
+      <w:lvlText w:val="o"/>
+      <w:lvlJc w:val="left"/>
+      <w:pPr>
+        <w:ind w:left="5760" w:hanging="360"/>
+      </w:pPr>
+      <w:rPr>
+        <w:rFonts w:ascii="Courier New" w:hAnsi="Courier New" w:cs="Courier New" w:hint="default"/>
+      </w:rPr>
+    </w:lvl>
+    <w:lvl w:ilvl="8">
+      <w:numFmt w:val="bullet"/>
+      <w:lvlText w:val=""/>
+      <w:lvlJc w:val="left"/>
+      <w:pPr>
+        <w:ind w:left="6480" w:hanging="360"/>
+      </w:pPr>
+      <w:rPr>
+        <w:rFonts w:ascii="Wingdings" w:hAnsi="Wingdings" w:cs="Wingdings" w:hint="default"/>
+      </w:rPr>
+    </w:lvl>
+  </w:abstractNum>
   <w:abstractNum w:abstractNumId="99201">
     <w:nsid w:val="00A99201"/>
     <w:multiLevelType w:val="multilevel"/>
@@ -11362,6 +11746,9 @@
     <w:abstractNumId w:val="990"/>
   </w:num>
   <w:num w:numId="1001">
+    <w:abstractNumId w:val="991"/>
+  </w:num>
+  <w:num w:numId="1002">
     <w:abstractNumId w:val="99201"/>
     <w:lvlOverride w:ilvl="0">
       <w:startOverride w:val="1"/>

</xml_diff>

<commit_message>
Add post-fix judge re-audit (92% agreement) and explicit novelty statement
</commit_message>
<xml_diff>
--- a/paper/main.docx
+++ b/paper/main.docx
@@ -1165,6 +1165,64 @@
       </w:r>
       <w:r>
         <w:t xml:space="preserve">account of what still does not work.</w:t>
+      </w:r>
+    </w:p>
+    <w:p>
+      <w:pPr>
+        <w:pStyle w:val="FirstParagraph"/>
+      </w:pPr>
+      <w:r>
+        <w:t xml:space="preserve">To our knowledge, this is the first paper to treat notebook serialization</w:t>
+      </w:r>
+      <w:r>
+        <w:t xml:space="preserve"> </w:t>
+      </w:r>
+      <w:r>
+        <w:t xml:space="preserve">format itself as a controlled experimental variable, holding the answer</w:t>
+      </w:r>
+      <w:r>
+        <w:t xml:space="preserve"> </w:t>
+      </w:r>
+      <w:r>
+        <w:t xml:space="preserve">model and prompt fixed and varying only how the notebook is encoded,</w:t>
+      </w:r>
+      <w:r>
+        <w:t xml:space="preserve"> </w:t>
+      </w:r>
+      <w:r>
+        <w:t xml:space="preserve">and to evaluate that variable specifically on crashed, out-of-order</w:t>
+      </w:r>
+      <w:r>
+        <w:t xml:space="preserve"> </w:t>
+      </w:r>
+      <w:r>
+        <w:t xml:space="preserve">notebooks rather than the cleaner, curated corpora used elsewhere in this</w:t>
+      </w:r>
+      <w:r>
+        <w:t xml:space="preserve"> </w:t>
+      </w:r>
+      <w:r>
+        <w:t xml:space="preserve">literature (Sect. </w:t>
+      </w:r>
+      <w:hyperlink w:anchor="sec:relwork">
+        <w:r>
+          <w:rPr>
+            <w:rStyle w:val="Hyperlink"/>
+          </w:rPr>
+          <w:t xml:space="preserve">7</w:t>
+        </w:r>
+      </w:hyperlink>
+      <w:r>
+        <w:t xml:space="preserve"> </w:t>
+      </w:r>
+      <w:r>
+        <w:t xml:space="preserve">contrasts this directly against the</w:t>
+      </w:r>
+      <w:r>
+        <w:t xml:space="preserve"> </w:t>
+      </w:r>
+      <w:r>
+        <w:t xml:space="preserve">closest prior systems).</w:t>
       </w:r>
     </w:p>
     <w:bookmarkEnd w:id="9"/>
@@ -7087,6 +7145,204 @@
         <w:t xml:space="preserve">.</w:t>
       </w:r>
     </w:p>
+    <w:p>
+      <w:pPr>
+        <w:pStyle w:val="BodyText"/>
+      </w:pPr>
+      <w:r>
+        <w:rPr>
+          <w:b/>
+          <w:bCs/>
+        </w:rPr>
+        <w:t xml:space="preserve">Post-fix confirmation.</w:t>
+      </w:r>
+      <w:r>
+        <w:t xml:space="preserve"> </w:t>
+      </w:r>
+      <w:r>
+        <w:t xml:space="preserve">A prompt fix is only as trustworthy as the</w:t>
+      </w:r>
+      <w:r>
+        <w:t xml:space="preserve"> </w:t>
+      </w:r>
+      <w:r>
+        <w:t xml:space="preserve">next independent check of it, so we repeated this audit on a second,</w:t>
+      </w:r>
+      <w:r>
+        <w:t xml:space="preserve"> </w:t>
+      </w:r>
+      <w:r>
+        <w:t xml:space="preserve">non-overlapping sample after applying the fix: 25 further rows, stratified</w:t>
+      </w:r>
+      <w:r>
+        <w:t xml:space="preserve"> </w:t>
+      </w:r>
+      <w:r>
+        <w:t xml:space="preserve">by condition, drawn with a different random seed (7) from the corrected-judge</w:t>
+      </w:r>
+      <w:r>
+        <w:t xml:space="preserve"> </w:t>
+      </w:r>
+      <w:r>
+        <w:t xml:space="preserve">dataset. Agreement rose from 76% to 92% (23 of 25). The two remaining</w:t>
+      </w:r>
+      <w:r>
+        <w:t xml:space="preserve"> </w:t>
+      </w:r>
+      <w:r>
+        <w:t xml:space="preserve">disagreements were both the same underlying variable</w:t>
+      </w:r>
+      <w:r>
+        <w:t xml:space="preserve"> </w:t>
+      </w:r>
+      <w:r>
+        <w:t xml:space="preserve">(</w:t>
+      </w:r>
+      <w:r>
+        <w:rPr>
+          <w:rStyle w:val="VerbatimChar"/>
+        </w:rPr>
+        <w:t xml:space="preserve">pandas_3.ipynb</w:t>
+      </w:r>
+      <w:r>
+        <w:t xml:space="preserve">’s</w:t>
+      </w:r>
+      <w:r>
+        <w:t xml:space="preserve"> </w:t>
+      </w:r>
+      <w:r>
+        <w:rPr>
+          <w:rStyle w:val="VerbatimChar"/>
+        </w:rPr>
+        <w:t xml:space="preserve">resultados</w:t>
+      </w:r>
+      <w:r>
+        <w:t xml:space="preserve">), where the judge credited a</w:t>
+      </w:r>
+      <w:r>
+        <w:t xml:space="preserve"> </w:t>
+      </w:r>
+      <w:r>
+        <w:t xml:space="preserve">fully-populated DataFrame answer as matching a stored decoy candidate that is</w:t>
+      </w:r>
+      <w:r>
+        <w:t xml:space="preserve"> </w:t>
+      </w:r>
+      <w:r>
+        <w:t xml:space="preserve">literally an</w:t>
+      </w:r>
+      <w:r>
+        <w:t xml:space="preserve"> </w:t>
+      </w:r>
+      <w:r>
+        <w:rPr>
+          <w:i/>
+          <w:iCs/>
+        </w:rPr>
+        <w:t xml:space="preserve">empty</w:t>
+      </w:r>
+      <w:r>
+        <w:t xml:space="preserve"> </w:t>
+      </w:r>
+      <w:r>
+        <w:t xml:space="preserve">DataFrame with matching column names but no rows,</w:t>
+      </w:r>
+      <w:r>
+        <w:t xml:space="preserve"> </w:t>
+      </w:r>
+      <w:r>
+        <w:t xml:space="preserve">a narrower, DataFrame-specific failure mode distinct from the null-candidate</w:t>
+      </w:r>
+      <w:r>
+        <w:t xml:space="preserve"> </w:t>
+      </w:r>
+      <w:r>
+        <w:t xml:space="preserve">bug described above. We report this as a residual limitation rather than a</w:t>
+      </w:r>
+      <w:r>
+        <w:t xml:space="preserve"> </w:t>
+      </w:r>
+      <w:r>
+        <w:t xml:space="preserve">clean bill of health: readers should continue to treat the exact</w:t>
+      </w:r>
+      <w:r>
+        <w:t xml:space="preserve"> </w:t>
+      </w:r>
+      <w:r>
+        <w:rPr>
+          <w:smallCaps/>
+        </w:rPr>
+        <w:t xml:space="preserve">truth</w:t>
+      </w:r>
+      <w:r>
+        <w:t xml:space="preserve">/</w:t>
+      </w:r>
+      <w:r>
+        <w:rPr>
+          <w:smallCaps/>
+        </w:rPr>
+        <w:t xml:space="preserve">decoy</w:t>
+      </w:r>
+      <w:r>
+        <w:t xml:space="preserve">/</w:t>
+      </w:r>
+      <w:r>
+        <w:rPr>
+          <w:smallCaps/>
+        </w:rPr>
+        <w:t xml:space="preserve">neither</w:t>
+      </w:r>
+      <w:r>
+        <w:t xml:space="preserve"> </w:t>
+      </w:r>
+      <w:r>
+        <w:t xml:space="preserve">counts in</w:t>
+      </w:r>
+      <w:r>
+        <w:t xml:space="preserve"> </w:t>
+      </w:r>
+      <w:r>
+        <w:t xml:space="preserve">Sect. </w:t>
+      </w:r>
+      <w:hyperlink w:anchor="sec:realnb">
+        <w:r>
+          <w:rPr>
+            <w:rStyle w:val="Hyperlink"/>
+          </w:rPr>
+          <w:t xml:space="preserve">5.4</w:t>
+        </w:r>
+      </w:hyperlink>
+      <w:r>
+        <w:t xml:space="preserve"> </w:t>
+      </w:r>
+      <w:r>
+        <w:t xml:space="preserve">as approximate, with the qualitative conclusion, no</w:t>
+      </w:r>
+      <w:r>
+        <w:t xml:space="preserve"> </w:t>
+      </w:r>
+      <w:r>
+        <w:t xml:space="preserve">detectable accuracy advantage at this scale, being what we actually stand</w:t>
+      </w:r>
+      <w:r>
+        <w:t xml:space="preserve"> </w:t>
+      </w:r>
+      <w:r>
+        <w:t xml:space="preserve">behind rather than any single precise tally. Full detail is in</w:t>
+      </w:r>
+      <w:r>
+        <w:t xml:space="preserve"> </w:t>
+      </w:r>
+      <w:r>
+        <w:rPr>
+          <w:rStyle w:val="VerbatimChar"/>
+        </w:rPr>
+        <w:t xml:space="preserve">reports/judge_post_fix_validation_report.md</w:t>
+      </w:r>
+      <w:r>
+        <w:t xml:space="preserve">.</w:t>
+      </w:r>
+    </w:p>
     <w:bookmarkStart w:id="32" w:name="fig:realstate"/>
     <w:p>
       <w:pPr>
@@ -9391,7 +9647,7 @@
     </w:p>
     <w:bookmarkEnd w:id="38"/>
     <w:bookmarkEnd w:id="39"/>
-    <w:bookmarkStart w:id="41" w:name="related-work"/>
+    <w:bookmarkStart w:id="41" w:name="sec:relwork"/>
     <w:p>
       <w:pPr>
         <w:pStyle w:val="Heading1"/>

</xml_diff>

<commit_message>
Fix editorial-office desk-reject issues: missing caption numbers, missing clinical trial statement
</commit_message>
<xml_diff>
--- a/paper/main.docx
+++ b/paper/main.docx
@@ -1496,7 +1496,7 @@
         <w:pStyle w:val="TableCaption"/>
       </w:pPr>
       <w:r>
-        <w:t xml:space="preserve">The three-tier treatment framework.</w:t>
+        <w:t xml:space="preserve">Table 1: The three-tier treatment framework.</w:t>
       </w:r>
     </w:p>
     <w:tbl>
@@ -1504,7 +1504,7 @@
         <w:tblStyle w:val="Table"/>
         <w:tblW w:type="auto" w:w="0"/>
         <w:tblLook w:firstRow="1" w:lastRow="0" w:firstColumn="0" w:lastColumn="0" w:noHBand="0" w:noVBand="0" w:val="0020"/>
-        <w:tblCaption w:val="The three-tier treatment framework."/>
+        <w:tblCaption w:val="Table 1: The three-tier treatment framework."/>
       </w:tblPr>
       <w:tblGrid>
         <w:gridCol w:w="1980"/>
@@ -3027,7 +3027,7 @@
         <w:pStyle w:val="ImageCaption"/>
       </w:pPr>
       <w:r>
-        <w:t xml:space="preserve">Preprocessing shrinks real notebooks by a median of 91.2%, with</w:t>
+        <w:t xml:space="preserve">Figure 1: Preprocessing shrinks real notebooks by a median of 91.2%, with</w:t>
       </w:r>
       <w:r>
         <w:t xml:space="preserve"> </w:t>
@@ -3744,7 +3744,7 @@
         <w:pStyle w:val="ImageCaption"/>
       </w:pPr>
       <w:r>
-        <w:t xml:space="preserve">Execution-order reordering closes the state-tracking gap</w:t>
+        <w:t xml:space="preserve">Figure 2: Execution-order reordering closes the state-tracking gap</w:t>
       </w:r>
       <w:r>
         <w:t xml:space="preserve"> </w:t>
@@ -3944,7 +3944,7 @@
         <w:pStyle w:val="TableCaption"/>
       </w:pPr>
       <w:r>
-        <w:t xml:space="preserve">Exact per-model accuracy on the stateful Notebook-NIAH benchmark.</w:t>
+        <w:t xml:space="preserve">Table 2: Exact per-model accuracy on the stateful Notebook-NIAH benchmark.</w:t>
       </w:r>
       <w:r>
         <w:t xml:space="preserve"> </w:t>
@@ -4003,7 +4003,7 @@
         <w:tblStyle w:val="Table"/>
         <w:tblW w:type="auto" w:w="0"/>
         <w:tblLook w:firstRow="1" w:lastRow="0" w:firstColumn="0" w:lastColumn="0" w:noHBand="0" w:noVBand="0" w:val="0020"/>
-        <w:tblCaption w:val="Exact per-model accuracy on the stateful Notebook-NIAH benchmark. The nine OpenAI models ran the full 36-trial grid; the six non-OpenAI models ran a reduced grid (3–6 trials) sized to each provider’s free-tier rate limit. ours is 100% on all fifteen models with no exception. Compiled automatically from per-model reports; see reports/model_curve_report.md."/>
+        <w:tblCaption w:val="Table 2: Exact per-model accuracy on the stateful Notebook-NIAH benchmark. The nine OpenAI models ran the full 36-trial grid; the six non-OpenAI models ran a reduced grid (3–6 trials) sized to each provider’s free-tier rate limit. ours is 100% on all fifteen models with no exception. Compiled automatically from per-model reports; see reports/model_curve_report.md."/>
       </w:tblPr>
       <w:tblGrid>
         <w:gridCol w:w="1980"/>
@@ -5237,7 +5237,7 @@
         <w:pStyle w:val="TableCaption"/>
       </w:pPr>
       <w:r>
-        <w:t xml:space="preserve">The 52 real order-divergent variables by notebook and</w:t>
+        <w:t xml:space="preserve">Table 3: The 52 real order-divergent variables by notebook and</w:t>
       </w:r>
       <w:r>
         <w:t xml:space="preserve"> </w:t>
@@ -5319,7 +5319,7 @@
         <w:tblStyle w:val="Table"/>
         <w:tblW w:type="auto" w:w="0"/>
         <w:tblLook w:firstRow="1" w:lastRow="0" w:firstColumn="0" w:lastColumn="0" w:noHBand="0" w:noVBand="0" w:val="0020"/>
-        <w:tblCaption w:val="The 52 real order-divergent variables by notebook and divergence type. Existence divergence (phantom variables) accounts for the large majority (41 of 52); value divergence, where a variable exists under both readings but holds a different value, accounts for the remaining 11. numpy_1.ipynb alone contributes 12 items, all existence divergence, and is the notebook responsible for the execution_count-sort edge case discussed in Sect. 6."/>
+        <w:tblCaption w:val="Table 3: The 52 real order-divergent variables by notebook and divergence type. Existence divergence (phantom variables) accounts for the large majority (41 of 52); value divergence, where a variable exists under both readings but holds a different value, accounts for the remaining 11. numpy_1.ipynb alone contributes 12 items, all existence divergence, and is the notebook responsible for the execution_count-sort edge case discussed in Sect. 6."/>
       </w:tblPr>
       <w:tblGrid>
         <w:gridCol w:w="1980"/>
@@ -7396,7 +7396,7 @@
         <w:pStyle w:val="ImageCaption"/>
       </w:pPr>
       <w:r>
-        <w:t xml:space="preserve">Raw JSON’s biggest problem on real notebooks is fitting in</w:t>
+        <w:t xml:space="preserve">Figure 3: Raw JSON’s biggest problem on real notebooks is fitting in</w:t>
       </w:r>
       <w:r>
         <w:t xml:space="preserve"> </w:t>
@@ -9774,7 +9774,7 @@
         <w:pStyle w:val="TableCaption"/>
       </w:pPr>
       <w:r>
-        <w:t xml:space="preserve">How the closest prior systems compare to this paper along the</w:t>
+        <w:t xml:space="preserve">Table 4: How the closest prior systems compare to this paper along the</w:t>
       </w:r>
       <w:r>
         <w:t xml:space="preserve"> </w:t>
@@ -9812,7 +9812,7 @@
         <w:tblStyle w:val="Table"/>
         <w:tblW w:type="auto" w:w="0"/>
         <w:tblLook w:firstRow="1" w:lastRow="0" w:firstColumn="0" w:lastColumn="0" w:noHBand="0" w:noVBand="0" w:val="0020"/>
-        <w:tblCaption w:val="How the closest prior systems compare to this paper along the dimensions that matter for our claim. None of the four vary serialization format as a controlled experimental variable the way we do; three of the four require a live kernel or agent-executed environment that our zero-LLM-cost, no-kernel setting is specifically designed to avoid needing."/>
+        <w:tblCaption w:val="Table 4: How the closest prior systems compare to this paper along the dimensions that matter for our claim. None of the four vary serialization format as a controlled experimental variable the way we do; three of the four require a live kernel or agent-executed environment that our zero-LLM-cost, no-kernel setting is specifically designed to avoid needing."/>
       </w:tblPr>
       <w:tblGrid>
         <w:gridCol w:w="1584"/>
@@ -10975,7 +10975,7 @@
       </w:r>
     </w:p>
     <w:bookmarkEnd w:id="42"/>
-    <w:bookmarkStart w:id="49" w:name="statements-and-declarations"/>
+    <w:bookmarkStart w:id="50" w:name="statements-and-declarations"/>
     <w:p>
       <w:pPr>
         <w:pStyle w:val="Heading1"/>
@@ -11115,7 +11115,25 @@
       </w:r>
     </w:p>
     <w:bookmarkEnd w:id="46"/>
-    <w:bookmarkStart w:id="48" w:name="data-availability."/>
+    <w:bookmarkStart w:id="47" w:name="clinical-trial-number."/>
+    <w:p>
+      <w:pPr>
+        <w:pStyle w:val="Heading4"/>
+      </w:pPr>
+      <w:r>
+        <w:t xml:space="preserve">Clinical trial number.</w:t>
+      </w:r>
+    </w:p>
+    <w:p>
+      <w:pPr>
+        <w:pStyle w:val="FirstParagraph"/>
+      </w:pPr>
+      <w:r>
+        <w:t xml:space="preserve">Not applicable.</w:t>
+      </w:r>
+    </w:p>
+    <w:bookmarkEnd w:id="47"/>
+    <w:bookmarkStart w:id="49" w:name="data-availability."/>
     <w:p>
       <w:pPr>
         <w:pStyle w:val="Heading4"/>
@@ -11195,7 +11213,7 @@
       <w:r>
         <w:t xml:space="preserve"> </w:t>
       </w:r>
-      <w:hyperlink r:id="rId47">
+      <w:hyperlink r:id="rId48">
         <w:r>
           <w:rPr>
             <w:rStyle w:val="Hyperlink"/>
@@ -11219,9 +11237,9 @@
         <w:t xml:space="preserve">declarations will be returned as incomplete.</w:t>
       </w:r>
     </w:p>
-    <w:bookmarkEnd w:id="48"/>
     <w:bookmarkEnd w:id="49"/>
-    <w:bookmarkStart w:id="66" w:name="references"/>
+    <w:bookmarkEnd w:id="50"/>
+    <w:bookmarkStart w:id="67" w:name="references"/>
     <w:p>
       <w:pPr>
         <w:pStyle w:val="Heading1"/>
@@ -11260,7 +11278,7 @@
       <w:r>
         <w:t xml:space="preserve"> </w:t>
       </w:r>
-      <w:hyperlink r:id="rId50">
+      <w:hyperlink r:id="rId51">
         <w:r>
           <w:rPr>
             <w:rStyle w:val="Hyperlink"/>
@@ -11285,7 +11303,7 @@
       <w:r>
         <w:t xml:space="preserve"> </w:t>
       </w:r>
-      <w:hyperlink r:id="rId51">
+      <w:hyperlink r:id="rId52">
         <w:r>
           <w:rPr>
             <w:rStyle w:val="Hyperlink"/>
@@ -11316,7 +11334,7 @@
       <w:r>
         <w:t xml:space="preserve"> </w:t>
       </w:r>
-      <w:hyperlink r:id="rId52">
+      <w:hyperlink r:id="rId53">
         <w:r>
           <w:rPr>
             <w:rStyle w:val="Hyperlink"/>
@@ -11347,7 +11365,7 @@
       <w:r>
         <w:t xml:space="preserve"> </w:t>
       </w:r>
-      <w:hyperlink r:id="rId53">
+      <w:hyperlink r:id="rId54">
         <w:r>
           <w:rPr>
             <w:rStyle w:val="Hyperlink"/>
@@ -11366,7 +11384,7 @@
       <w:r>
         <w:t xml:space="preserve"> </w:t>
       </w:r>
-      <w:hyperlink r:id="rId54">
+      <w:hyperlink r:id="rId55">
         <w:r>
           <w:rPr>
             <w:rStyle w:val="Hyperlink"/>
@@ -11406,7 +11424,7 @@
       <w:r>
         <w:t xml:space="preserve"> </w:t>
       </w:r>
-      <w:hyperlink r:id="rId55">
+      <w:hyperlink r:id="rId56">
         <w:r>
           <w:rPr>
             <w:rStyle w:val="Hyperlink"/>
@@ -11437,7 +11455,7 @@
       <w:r>
         <w:t xml:space="preserve"> </w:t>
       </w:r>
-      <w:hyperlink r:id="rId56">
+      <w:hyperlink r:id="rId57">
         <w:r>
           <w:rPr>
             <w:rStyle w:val="Hyperlink"/>
@@ -11456,7 +11474,7 @@
       <w:r>
         <w:t xml:space="preserve"> </w:t>
       </w:r>
-      <w:hyperlink r:id="rId57">
+      <w:hyperlink r:id="rId58">
         <w:r>
           <w:rPr>
             <w:rStyle w:val="Hyperlink"/>
@@ -11478,7 +11496,7 @@
       <w:r>
         <w:t xml:space="preserve"> </w:t>
       </w:r>
-      <w:hyperlink r:id="rId58">
+      <w:hyperlink r:id="rId59">
         <w:r>
           <w:rPr>
             <w:rStyle w:val="Hyperlink"/>
@@ -11512,7 +11530,7 @@
       <w:r>
         <w:t xml:space="preserve"> </w:t>
       </w:r>
-      <w:hyperlink r:id="rId59">
+      <w:hyperlink r:id="rId60">
         <w:r>
           <w:rPr>
             <w:rStyle w:val="Hyperlink"/>
@@ -11537,7 +11555,7 @@
       <w:r>
         <w:t xml:space="preserve"> </w:t>
       </w:r>
-      <w:hyperlink r:id="rId60">
+      <w:hyperlink r:id="rId61">
         <w:r>
           <w:rPr>
             <w:rStyle w:val="Hyperlink"/>
@@ -11568,7 +11586,7 @@
       <w:r>
         <w:t xml:space="preserve"> </w:t>
       </w:r>
-      <w:hyperlink r:id="rId61">
+      <w:hyperlink r:id="rId62">
         <w:r>
           <w:rPr>
             <w:rStyle w:val="Hyperlink"/>
@@ -11608,7 +11626,7 @@
       <w:r>
         <w:t xml:space="preserve"> </w:t>
       </w:r>
-      <w:hyperlink r:id="rId62">
+      <w:hyperlink r:id="rId63">
         <w:r>
           <w:rPr>
             <w:rStyle w:val="Hyperlink"/>
@@ -11622,7 +11640,7 @@
       <w:r>
         <w:t xml:space="preserve"> </w:t>
       </w:r>
-      <w:hyperlink r:id="rId63">
+      <w:hyperlink r:id="rId64">
         <w:r>
           <w:rPr>
             <w:rStyle w:val="Hyperlink"/>
@@ -11653,7 +11671,7 @@
       <w:r>
         <w:t xml:space="preserve"> </w:t>
       </w:r>
-      <w:hyperlink r:id="rId64">
+      <w:hyperlink r:id="rId65">
         <w:r>
           <w:rPr>
             <w:rStyle w:val="Hyperlink"/>
@@ -11690,7 +11708,7 @@
       <w:r>
         <w:t xml:space="preserve"> </w:t>
       </w:r>
-      <w:hyperlink r:id="rId65">
+      <w:hyperlink r:id="rId66">
         <w:r>
           <w:rPr>
             <w:rStyle w:val="Hyperlink"/>
@@ -11699,7 +11717,7 @@
         </w:r>
       </w:hyperlink>
     </w:p>
-    <w:bookmarkEnd w:id="66"/>
+    <w:bookmarkEnd w:id="67"/>
     <w:sectPr>
       <w:footnotePr>
         <w:numRestart w:val="eachSect"/>

</xml_diff>